<commit_message>
Set author name to 'Sophie E T' across covers, interior, listing, and docs
Regenerated all assets: eBook cover, paperback wrap (PDF + PNG preview),
interior DOCX title page, KDP publishing kit, launch checklist, and design
preview page now credit Sophie E T (replacing the placeholder pen name).

Co-Authored-By: Claude Opus 4.8 <noreply@anthropic.com>
Claude-Session: https://claude.ai/code/session_01JCcmUyJoKcg4A35MRUqzX3
</commit_message>
<xml_diff>
--- a/book/KDP-interior-6x9.docx
+++ b/book/KDP-interior-6x9.docx
@@ -46,7 +46,19 @@
       </w:r>
     </w:p>
     <w:p/>
-    <w:p/>
+    <w:p>
+      <w:pPr>
+        <w:spacing w:before="120"/>
+        <w:jc w:val="center"/>
+      </w:pPr>
+      <w:r>
+        <w:rPr>
+          <w:rFonts w:ascii="Georgia" w:hAnsi="Georgia"/>
+          <w:sz w:val="30"/>
+        </w:rPr>
+        <w:t>SOPHIE E T</w:t>
+      </w:r>
+    </w:p>
     <w:p/>
     <w:p/>
     <w:p/>

</xml_diff>

<commit_message>
Add 'Also by' cross-promotion back-matter pages to all four books
Standard KDP best practice: each book now ends with an 'Also by Sophie E T' /
'Otros libros de Sophie E T' page listing the other titles in the series
(companion + Spanish/English editions) with one-line pitches. Rebuilt all four
manuscripts and print interiors.

Co-Authored-By: Claude Opus 4.8 <noreply@anthropic.com>
Claude-Session: https://claude.ai/code/session_01JCcmUyJoKcg4A35MRUqzX3
</commit_message>
<xml_diff>
--- a/book/KDP-interior-6x9.docx
+++ b/book/KDP-interior-6x9.docx
@@ -8296,6 +8296,120 @@
       </w:pPr>
       <w:r>
         <w:t>If this book helped you see clearly, the kindest thing you can do is leave an honest review so the next curious reader can find it.</w:t>
+      </w:r>
+    </w:p>
+    <w:p>
+      <w:r>
+        <w:br w:type="page"/>
+      </w:r>
+    </w:p>
+    <w:p>
+      <w:pPr>
+        <w:pStyle w:val="ChapHead"/>
+        <w:outlineLvl w:val="1"/>
+      </w:pPr>
+      <w:r>
+        <w:t>Also by Sophie E T</w:t>
+      </w:r>
+    </w:p>
+    <w:p>
+      <w:pPr>
+        <w:pStyle w:val="Body"/>
+      </w:pPr>
+      <w:r>
+        <w:t xml:space="preserve">If </w:t>
+      </w:r>
+      <w:r>
+        <w:rPr>
+          <w:i/>
+        </w:rPr>
+        <w:t>Mormons: The Latter-day Saints Explained</w:t>
+      </w:r>
+      <w:r>
+        <w:t xml:space="preserve"> was useful, you may enjoy the rest of the series:</w:t>
+      </w:r>
+    </w:p>
+    <w:p>
+      <w:pPr>
+        <w:pStyle w:val="Body"/>
+      </w:pPr>
+      <w:r>
+        <w:rPr>
+          <w:b/>
+        </w:rPr>
+        <w:t>100 Questions About Mormonism</w:t>
+      </w:r>
+    </w:p>
+    <w:p>
+      <w:pPr>
+        <w:pStyle w:val="Body"/>
+      </w:pPr>
+      <w:r>
+        <w:t xml:space="preserve">The companion Q&amp;A guide — the one hundred questions people most often ask about the Latter-day Saints, each answered in a clear page or two. Perfect for looking something up fast or settling a dinner-table debate. </w:t>
+      </w:r>
+      <w:r>
+        <w:rPr>
+          <w:i/>
+        </w:rPr>
+        <w:t>Available on Amazon.</w:t>
+      </w:r>
+    </w:p>
+    <w:p>
+      <w:pPr>
+        <w:pStyle w:val="Body"/>
+      </w:pPr>
+      <w:r>
+        <w:rPr>
+          <w:b/>
+        </w:rPr>
+        <w:t>Mormones: Los Santos de los Últimos Días, Explicados</w:t>
+      </w:r>
+    </w:p>
+    <w:p>
+      <w:pPr>
+        <w:pStyle w:val="Body"/>
+      </w:pPr>
+      <w:r>
+        <w:t xml:space="preserve">This same book, in Spanish. </w:t>
+      </w:r>
+      <w:r>
+        <w:rPr>
+          <w:i/>
+        </w:rPr>
+        <w:t>Disponible en Amazon.</w:t>
+      </w:r>
+    </w:p>
+    <w:p>
+      <w:pPr>
+        <w:pStyle w:val="Body"/>
+      </w:pPr>
+      <w:r>
+        <w:rPr>
+          <w:b/>
+        </w:rPr>
+        <w:t>100 preguntas sobre el mormonismo</w:t>
+      </w:r>
+    </w:p>
+    <w:p>
+      <w:pPr>
+        <w:pStyle w:val="Body"/>
+      </w:pPr>
+      <w:r>
+        <w:t xml:space="preserve">The Spanish-language companion Q&amp;A. </w:t>
+      </w:r>
+      <w:r>
+        <w:rPr>
+          <w:i/>
+        </w:rPr>
+        <w:t>Disponible en Amazon.</w:t>
+      </w:r>
+    </w:p>
+    <w:p>
+      <w:pPr>
+        <w:pStyle w:val="Body"/>
+      </w:pPr>
+      <w:r>
+        <w:t>Thank you for reading — and for your curiosity.</w:t>
       </w:r>
     </w:p>
     <w:sectPr>

</xml_diff>

<commit_message>
Fix Kindle TOC: use built-in Heading 1/2 styles in all four interiors
KDP builds the Kindle logical table of contents from Word's built-in Heading
styles. The interiors previously used custom styles with outline levels, which
KDP did not detect ('missing table of contents' warning). Switched part/chapter
headings to Heading 1/Heading 2 (keeping the same visual formatting) so the
clickable TOC/navigation is generated. Rebuilt all four DOCX interiors.

Co-Authored-By: Claude Opus 4.8 <noreply@anthropic.com>
Claude-Session: https://claude.ai/code/session_01JCcmUyJoKcg4A35MRUqzX3
</commit_message>
<xml_diff>
--- a/book/KDP-interior-6x9.docx
+++ b/book/KDP-interior-6x9.docx
@@ -214,10 +214,18 @@
     </w:p>
     <w:p>
       <w:pPr>
-        <w:pStyle w:val="ChapHead"/>
-        <w:outlineLvl w:val="1"/>
-      </w:pPr>
-      <w:r>
+        <w:pStyle w:val="Heading2"/>
+        <w:keepNext/>
+        <w:spacing w:before="600" w:after="320"/>
+        <w:jc w:val="center"/>
+      </w:pPr>
+      <w:r>
+        <w:rPr>
+          <w:rFonts w:ascii="Georgia" w:hAnsi="Georgia"/>
+          <w:b/>
+          <w:color w:val="1A1A1A"/>
+          <w:sz w:val="34"/>
+        </w:rPr>
         <w:t>A Note on Names: "Mormon" or "Latter-day Saint"?</w:t>
       </w:r>
     </w:p>
@@ -340,10 +348,18 @@
     </w:p>
     <w:p>
       <w:pPr>
-        <w:pStyle w:val="PartHead"/>
-        <w:outlineLvl w:val="0"/>
-      </w:pPr>
-      <w:r>
+        <w:pStyle w:val="Heading1"/>
+        <w:keepNext/>
+        <w:spacing w:before="720" w:after="360"/>
+        <w:jc w:val="center"/>
+      </w:pPr>
+      <w:r>
+        <w:rPr>
+          <w:rFonts w:ascii="Georgia" w:hAnsi="Georgia"/>
+          <w:b/>
+          <w:color w:val="1A1A1A"/>
+          <w:sz w:val="48"/>
+        </w:rPr>
         <w:t>Introduction: The Mormon Moment</w:t>
       </w:r>
     </w:p>
@@ -592,10 +608,18 @@
     </w:p>
     <w:p>
       <w:pPr>
-        <w:pStyle w:val="PartHead"/>
-        <w:outlineLvl w:val="0"/>
-      </w:pPr>
-      <w:r>
+        <w:pStyle w:val="Heading1"/>
+        <w:keepNext/>
+        <w:spacing w:before="720" w:after="360"/>
+        <w:jc w:val="center"/>
+      </w:pPr>
+      <w:r>
+        <w:rPr>
+          <w:rFonts w:ascii="Georgia" w:hAnsi="Georgia"/>
+          <w:b/>
+          <w:color w:val="1A1A1A"/>
+          <w:sz w:val="48"/>
+        </w:rPr>
         <w:t>PART ONE — Who Are They, Really?</w:t>
       </w:r>
     </w:p>
@@ -606,10 +630,18 @@
     </w:p>
     <w:p>
       <w:pPr>
-        <w:pStyle w:val="ChapHead"/>
-        <w:outlineLvl w:val="1"/>
-      </w:pPr>
-      <w:r>
+        <w:pStyle w:val="Heading2"/>
+        <w:keepNext/>
+        <w:spacing w:before="600" w:after="320"/>
+        <w:jc w:val="center"/>
+      </w:pPr>
+      <w:r>
+        <w:rPr>
+          <w:rFonts w:ascii="Georgia" w:hAnsi="Georgia"/>
+          <w:b/>
+          <w:color w:val="1A1A1A"/>
+          <w:sz w:val="34"/>
+        </w:rPr>
         <w:t>Chapter 1 — From the Margins to the Mainstream</w:t>
       </w:r>
     </w:p>
@@ -797,10 +829,18 @@
     </w:p>
     <w:p>
       <w:pPr>
-        <w:pStyle w:val="ChapHead"/>
-        <w:outlineLvl w:val="1"/>
-      </w:pPr>
-      <w:r>
+        <w:pStyle w:val="Heading2"/>
+        <w:keepNext/>
+        <w:spacing w:before="600" w:after="320"/>
+        <w:jc w:val="center"/>
+      </w:pPr>
+      <w:r>
+        <w:rPr>
+          <w:rFonts w:ascii="Georgia" w:hAnsi="Georgia"/>
+          <w:b/>
+          <w:color w:val="1A1A1A"/>
+          <w:sz w:val="34"/>
+        </w:rPr>
         <w:t>Chapter 2 — A Portrait in Numbers</w:t>
       </w:r>
     </w:p>
@@ -1105,10 +1145,18 @@
     </w:p>
     <w:p>
       <w:pPr>
-        <w:pStyle w:val="ChapHead"/>
-        <w:outlineLvl w:val="1"/>
-      </w:pPr>
-      <w:r>
+        <w:pStyle w:val="Heading2"/>
+        <w:keepNext/>
+        <w:spacing w:before="600" w:after="320"/>
+        <w:jc w:val="center"/>
+      </w:pPr>
+      <w:r>
+        <w:rPr>
+          <w:rFonts w:ascii="Georgia" w:hAnsi="Georgia"/>
+          <w:b/>
+          <w:color w:val="1A1A1A"/>
+          <w:sz w:val="34"/>
+        </w:rPr>
         <w:t>Chapter 3 — What Latter-day Saints Actually Believe</w:t>
       </w:r>
     </w:p>
@@ -1445,10 +1493,18 @@
     </w:p>
     <w:p>
       <w:pPr>
-        <w:pStyle w:val="ChapHead"/>
-        <w:outlineLvl w:val="1"/>
-      </w:pPr>
-      <w:r>
+        <w:pStyle w:val="Heading2"/>
+        <w:keepNext/>
+        <w:spacing w:before="600" w:after="320"/>
+        <w:jc w:val="center"/>
+      </w:pPr>
+      <w:r>
+        <w:rPr>
+          <w:rFonts w:ascii="Georgia" w:hAnsi="Georgia"/>
+          <w:b/>
+          <w:color w:val="1A1A1A"/>
+          <w:sz w:val="34"/>
+        </w:rPr>
         <w:t>Chapter 4 — Are Mormons Christian?</w:t>
       </w:r>
     </w:p>
@@ -1807,10 +1863,18 @@
     </w:p>
     <w:p>
       <w:pPr>
-        <w:pStyle w:val="PartHead"/>
-        <w:outlineLvl w:val="0"/>
-      </w:pPr>
-      <w:r>
+        <w:pStyle w:val="Heading1"/>
+        <w:keepNext/>
+        <w:spacing w:before="720" w:after="360"/>
+        <w:jc w:val="center"/>
+      </w:pPr>
+      <w:r>
+        <w:rPr>
+          <w:rFonts w:ascii="Georgia" w:hAnsi="Georgia"/>
+          <w:b/>
+          <w:color w:val="1A1A1A"/>
+          <w:sz w:val="48"/>
+        </w:rPr>
         <w:t>PART TWO — The Story: How It All Began</w:t>
       </w:r>
     </w:p>
@@ -1821,10 +1885,18 @@
     </w:p>
     <w:p>
       <w:pPr>
-        <w:pStyle w:val="ChapHead"/>
-        <w:outlineLvl w:val="1"/>
-      </w:pPr>
-      <w:r>
+        <w:pStyle w:val="Heading2"/>
+        <w:keepNext/>
+        <w:spacing w:before="600" w:after="320"/>
+        <w:jc w:val="center"/>
+      </w:pPr>
+      <w:r>
+        <w:rPr>
+          <w:rFonts w:ascii="Georgia" w:hAnsi="Georgia"/>
+          <w:b/>
+          <w:color w:val="1A1A1A"/>
+          <w:sz w:val="34"/>
+        </w:rPr>
         <w:t>Chapter 5 — A Boy, a Grove, and a Question</w:t>
       </w:r>
     </w:p>
@@ -1994,10 +2066,18 @@
     </w:p>
     <w:p>
       <w:pPr>
-        <w:pStyle w:val="ChapHead"/>
-        <w:outlineLvl w:val="1"/>
-      </w:pPr>
-      <w:r>
+        <w:pStyle w:val="Heading2"/>
+        <w:keepNext/>
+        <w:spacing w:before="600" w:after="320"/>
+        <w:jc w:val="center"/>
+      </w:pPr>
+      <w:r>
+        <w:rPr>
+          <w:rFonts w:ascii="Georgia" w:hAnsi="Georgia"/>
+          <w:b/>
+          <w:color w:val="1A1A1A"/>
+          <w:sz w:val="34"/>
+        </w:rPr>
         <w:t>Chapter 6 — The Book of Mormon</w:t>
       </w:r>
     </w:p>
@@ -2279,10 +2359,18 @@
     </w:p>
     <w:p>
       <w:pPr>
-        <w:pStyle w:val="ChapHead"/>
-        <w:outlineLvl w:val="1"/>
-      </w:pPr>
-      <w:r>
+        <w:pStyle w:val="Heading2"/>
+        <w:keepNext/>
+        <w:spacing w:before="600" w:after="320"/>
+        <w:jc w:val="center"/>
+      </w:pPr>
+      <w:r>
+        <w:rPr>
+          <w:rFonts w:ascii="Georgia" w:hAnsi="Georgia"/>
+          <w:b/>
+          <w:color w:val="1A1A1A"/>
+          <w:sz w:val="34"/>
+        </w:rPr>
         <w:t>Chapter 7 — Persecution, Nauvoo, and a Murder</w:t>
       </w:r>
     </w:p>
@@ -2458,10 +2546,18 @@
     </w:p>
     <w:p>
       <w:pPr>
-        <w:pStyle w:val="ChapHead"/>
-        <w:outlineLvl w:val="1"/>
-      </w:pPr>
-      <w:r>
+        <w:pStyle w:val="Heading2"/>
+        <w:keepNext/>
+        <w:spacing w:before="600" w:after="320"/>
+        <w:jc w:val="center"/>
+      </w:pPr>
+      <w:r>
+        <w:rPr>
+          <w:rFonts w:ascii="Georgia" w:hAnsi="Georgia"/>
+          <w:b/>
+          <w:color w:val="1A1A1A"/>
+          <w:sz w:val="34"/>
+        </w:rPr>
         <w:t>Chapter 8 — The Trek West and the Making of a Homeland</w:t>
       </w:r>
     </w:p>
@@ -2636,10 +2732,18 @@
     </w:p>
     <w:p>
       <w:pPr>
-        <w:pStyle w:val="ChapHead"/>
-        <w:outlineLvl w:val="1"/>
-      </w:pPr>
-      <w:r>
+        <w:pStyle w:val="Heading2"/>
+        <w:keepNext/>
+        <w:spacing w:before="600" w:after="320"/>
+        <w:jc w:val="center"/>
+      </w:pPr>
+      <w:r>
+        <w:rPr>
+          <w:rFonts w:ascii="Georgia" w:hAnsi="Georgia"/>
+          <w:b/>
+          <w:color w:val="1A1A1A"/>
+          <w:sz w:val="34"/>
+        </w:rPr>
         <w:t>Chapter 9 — Polygamy: The Rise, the Fall, and the Long Shadow</w:t>
       </w:r>
     </w:p>
@@ -2850,10 +2954,18 @@
     </w:p>
     <w:p>
       <w:pPr>
-        <w:pStyle w:val="PartHead"/>
-        <w:outlineLvl w:val="0"/>
-      </w:pPr>
-      <w:r>
+        <w:pStyle w:val="Heading1"/>
+        <w:keepNext/>
+        <w:spacing w:before="720" w:after="360"/>
+        <w:jc w:val="center"/>
+      </w:pPr>
+      <w:r>
+        <w:rPr>
+          <w:rFonts w:ascii="Georgia" w:hAnsi="Georgia"/>
+          <w:b/>
+          <w:color w:val="1A1A1A"/>
+          <w:sz w:val="48"/>
+        </w:rPr>
         <w:t>PART THREE — The Life: Faith in Practice</w:t>
       </w:r>
     </w:p>
@@ -2864,10 +2976,18 @@
     </w:p>
     <w:p>
       <w:pPr>
-        <w:pStyle w:val="ChapHead"/>
-        <w:outlineLvl w:val="1"/>
-      </w:pPr>
-      <w:r>
+        <w:pStyle w:val="Heading2"/>
+        <w:keepNext/>
+        <w:spacing w:before="600" w:after="320"/>
+        <w:jc w:val="center"/>
+      </w:pPr>
+      <w:r>
+        <w:rPr>
+          <w:rFonts w:ascii="Georgia" w:hAnsi="Georgia"/>
+          <w:b/>
+          <w:color w:val="1A1A1A"/>
+          <w:sz w:val="34"/>
+        </w:rPr>
         <w:t>Chapter 10 — Inside the Meetinghouse</w:t>
       </w:r>
     </w:p>
@@ -3300,10 +3420,18 @@
     </w:p>
     <w:p>
       <w:pPr>
-        <w:pStyle w:val="ChapHead"/>
-        <w:outlineLvl w:val="1"/>
-      </w:pPr>
-      <w:r>
+        <w:pStyle w:val="Heading2"/>
+        <w:keepNext/>
+        <w:spacing w:before="600" w:after="320"/>
+        <w:jc w:val="center"/>
+      </w:pPr>
+      <w:r>
+        <w:rPr>
+          <w:rFonts w:ascii="Georgia" w:hAnsi="Georgia"/>
+          <w:b/>
+          <w:color w:val="1A1A1A"/>
+          <w:sz w:val="34"/>
+        </w:rPr>
         <w:t>Chapter 11 — The Temple: The Most Misunderstood Building in America</w:t>
       </w:r>
     </w:p>
@@ -3558,10 +3686,18 @@
     </w:p>
     <w:p>
       <w:pPr>
-        <w:pStyle w:val="ChapHead"/>
-        <w:outlineLvl w:val="1"/>
-      </w:pPr>
-      <w:r>
+        <w:pStyle w:val="Heading2"/>
+        <w:keepNext/>
+        <w:spacing w:before="600" w:after="320"/>
+        <w:jc w:val="center"/>
+      </w:pPr>
+      <w:r>
+        <w:rPr>
+          <w:rFonts w:ascii="Georgia" w:hAnsi="Georgia"/>
+          <w:b/>
+          <w:color w:val="1A1A1A"/>
+          <w:sz w:val="34"/>
+        </w:rPr>
         <w:t>Chapter 12 — The Word of Wisdom: Coffee, Caffeine, and the Rules</w:t>
       </w:r>
     </w:p>
@@ -3882,10 +4018,18 @@
     </w:p>
     <w:p>
       <w:pPr>
-        <w:pStyle w:val="ChapHead"/>
-        <w:outlineLvl w:val="1"/>
-      </w:pPr>
-      <w:r>
+        <w:pStyle w:val="Heading2"/>
+        <w:keepNext/>
+        <w:spacing w:before="600" w:after="320"/>
+        <w:jc w:val="center"/>
+      </w:pPr>
+      <w:r>
+        <w:rPr>
+          <w:rFonts w:ascii="Georgia" w:hAnsi="Georgia"/>
+          <w:b/>
+          <w:color w:val="1A1A1A"/>
+          <w:sz w:val="34"/>
+        </w:rPr>
         <w:t>Chapter 13 — The Mission</w:t>
       </w:r>
     </w:p>
@@ -4077,10 +4221,18 @@
     </w:p>
     <w:p>
       <w:pPr>
-        <w:pStyle w:val="ChapHead"/>
-        <w:outlineLvl w:val="1"/>
-      </w:pPr>
-      <w:r>
+        <w:pStyle w:val="Heading2"/>
+        <w:keepNext/>
+        <w:spacing w:before="600" w:after="320"/>
+        <w:jc w:val="center"/>
+      </w:pPr>
+      <w:r>
+        <w:rPr>
+          <w:rFonts w:ascii="Georgia" w:hAnsi="Georgia"/>
+          <w:b/>
+          <w:color w:val="1A1A1A"/>
+          <w:sz w:val="34"/>
+        </w:rPr>
         <w:t>Chapter 14 — Family, Gender, and the Women of the Church</w:t>
       </w:r>
     </w:p>
@@ -4300,10 +4452,18 @@
     </w:p>
     <w:p>
       <w:pPr>
-        <w:pStyle w:val="ChapHead"/>
-        <w:outlineLvl w:val="1"/>
-      </w:pPr>
-      <w:r>
+        <w:pStyle w:val="Heading2"/>
+        <w:keepNext/>
+        <w:spacing w:before="600" w:after="320"/>
+        <w:jc w:val="center"/>
+      </w:pPr>
+      <w:r>
+        <w:rPr>
+          <w:rFonts w:ascii="Georgia" w:hAnsi="Georgia"/>
+          <w:b/>
+          <w:color w:val="1A1A1A"/>
+          <w:sz w:val="34"/>
+        </w:rPr>
         <w:t>Chapter 15 — Tithing, Welfare, and the Business of the Church</w:t>
       </w:r>
     </w:p>
@@ -4513,10 +4673,18 @@
     </w:p>
     <w:p>
       <w:pPr>
-        <w:pStyle w:val="PartHead"/>
-        <w:outlineLvl w:val="0"/>
-      </w:pPr>
-      <w:r>
+        <w:pStyle w:val="Heading1"/>
+        <w:keepNext/>
+        <w:spacing w:before="720" w:after="360"/>
+        <w:jc w:val="center"/>
+      </w:pPr>
+      <w:r>
+        <w:rPr>
+          <w:rFonts w:ascii="Georgia" w:hAnsi="Georgia"/>
+          <w:b/>
+          <w:color w:val="1A1A1A"/>
+          <w:sz w:val="48"/>
+        </w:rPr>
         <w:t>PART FOUR — The Hard Questions and the Future</w:t>
       </w:r>
     </w:p>
@@ -4527,10 +4695,18 @@
     </w:p>
     <w:p>
       <w:pPr>
-        <w:pStyle w:val="ChapHead"/>
-        <w:outlineLvl w:val="1"/>
-      </w:pPr>
-      <w:r>
+        <w:pStyle w:val="Heading2"/>
+        <w:keepNext/>
+        <w:spacing w:before="600" w:after="320"/>
+        <w:jc w:val="center"/>
+      </w:pPr>
+      <w:r>
+        <w:rPr>
+          <w:rFonts w:ascii="Georgia" w:hAnsi="Georgia"/>
+          <w:b/>
+          <w:color w:val="1A1A1A"/>
+          <w:sz w:val="34"/>
+        </w:rPr>
         <w:t>Chapter 16 — Race and the Priesthood</w:t>
       </w:r>
     </w:p>
@@ -4777,10 +4953,18 @@
     </w:p>
     <w:p>
       <w:pPr>
-        <w:pStyle w:val="ChapHead"/>
-        <w:outlineLvl w:val="1"/>
-      </w:pPr>
-      <w:r>
+        <w:pStyle w:val="Heading2"/>
+        <w:keepNext/>
+        <w:spacing w:before="600" w:after="320"/>
+        <w:jc w:val="center"/>
+      </w:pPr>
+      <w:r>
+        <w:rPr>
+          <w:rFonts w:ascii="Georgia" w:hAnsi="Georgia"/>
+          <w:b/>
+          <w:color w:val="1A1A1A"/>
+          <w:sz w:val="34"/>
+        </w:rPr>
         <w:t>Chapter 17 — LGBTQ+ Latter-day Saints</w:t>
       </w:r>
     </w:p>
@@ -5073,10 +5257,18 @@
     </w:p>
     <w:p>
       <w:pPr>
-        <w:pStyle w:val="ChapHead"/>
-        <w:outlineLvl w:val="1"/>
-      </w:pPr>
-      <w:r>
+        <w:pStyle w:val="Heading2"/>
+        <w:keepNext/>
+        <w:spacing w:before="600" w:after="320"/>
+        <w:jc w:val="center"/>
+      </w:pPr>
+      <w:r>
+        <w:rPr>
+          <w:rFonts w:ascii="Georgia" w:hAnsi="Georgia"/>
+          <w:b/>
+          <w:color w:val="1A1A1A"/>
+          <w:sz w:val="34"/>
+        </w:rPr>
         <w:t>Chapter 18 — Leaving, Doubting, and the "Faith Crisis"</w:t>
       </w:r>
     </w:p>
@@ -5359,10 +5551,18 @@
     </w:p>
     <w:p>
       <w:pPr>
-        <w:pStyle w:val="ChapHead"/>
-        <w:outlineLvl w:val="1"/>
-      </w:pPr>
-      <w:r>
+        <w:pStyle w:val="Heading2"/>
+        <w:keepNext/>
+        <w:spacing w:before="600" w:after="320"/>
+        <w:jc w:val="center"/>
+      </w:pPr>
+      <w:r>
+        <w:rPr>
+          <w:rFonts w:ascii="Georgia" w:hAnsi="Georgia"/>
+          <w:b/>
+          <w:color w:val="1A1A1A"/>
+          <w:sz w:val="34"/>
+        </w:rPr>
         <w:t>Chapter 19 — The Fundamentalists: The Cults That Kept the Name</w:t>
       </w:r>
     </w:p>
@@ -5588,10 +5788,18 @@
     </w:p>
     <w:p>
       <w:pPr>
-        <w:pStyle w:val="ChapHead"/>
-        <w:outlineLvl w:val="1"/>
-      </w:pPr>
-      <w:r>
+        <w:pStyle w:val="Heading2"/>
+        <w:keepNext/>
+        <w:spacing w:before="600" w:after="320"/>
+        <w:jc w:val="center"/>
+      </w:pPr>
+      <w:r>
+        <w:rPr>
+          <w:rFonts w:ascii="Georgia" w:hAnsi="Georgia"/>
+          <w:b/>
+          <w:color w:val="1A1A1A"/>
+          <w:sz w:val="34"/>
+        </w:rPr>
         <w:t>Chapter 20 — Mormons in the Spotlight: Politics, Business, and the Screen</w:t>
       </w:r>
     </w:p>
@@ -5763,10 +5971,18 @@
     </w:p>
     <w:p>
       <w:pPr>
-        <w:pStyle w:val="ChapHead"/>
-        <w:outlineLvl w:val="1"/>
-      </w:pPr>
-      <w:r>
+        <w:pStyle w:val="Heading2"/>
+        <w:keepNext/>
+        <w:spacing w:before="600" w:after="320"/>
+        <w:jc w:val="center"/>
+      </w:pPr>
+      <w:r>
+        <w:rPr>
+          <w:rFonts w:ascii="Georgia" w:hAnsi="Georgia"/>
+          <w:b/>
+          <w:color w:val="1A1A1A"/>
+          <w:sz w:val="34"/>
+        </w:rPr>
         <w:t>Chapter 21 — A Good Neighbor's Guide</w:t>
       </w:r>
     </w:p>
@@ -6034,10 +6250,18 @@
     </w:p>
     <w:p>
       <w:pPr>
-        <w:pStyle w:val="ChapHead"/>
-        <w:outlineLvl w:val="1"/>
-      </w:pPr>
-      <w:r>
+        <w:pStyle w:val="Heading2"/>
+        <w:keepNext/>
+        <w:spacing w:before="600" w:after="320"/>
+        <w:jc w:val="center"/>
+      </w:pPr>
+      <w:r>
+        <w:rPr>
+          <w:rFonts w:ascii="Georgia" w:hAnsi="Georgia"/>
+          <w:b/>
+          <w:color w:val="1A1A1A"/>
+          <w:sz w:val="34"/>
+        </w:rPr>
         <w:t>Chapter 22 — Myths vs. Reality: The Questions People Actually Ask</w:t>
       </w:r>
     </w:p>
@@ -6862,10 +7086,18 @@
     </w:p>
     <w:p>
       <w:pPr>
-        <w:pStyle w:val="ChapHead"/>
-        <w:outlineLvl w:val="1"/>
-      </w:pPr>
-      <w:r>
+        <w:pStyle w:val="Heading2"/>
+        <w:keepNext/>
+        <w:spacing w:before="600" w:after="320"/>
+        <w:jc w:val="center"/>
+      </w:pPr>
+      <w:r>
+        <w:rPr>
+          <w:rFonts w:ascii="Georgia" w:hAnsi="Georgia"/>
+          <w:b/>
+          <w:color w:val="1A1A1A"/>
+          <w:sz w:val="34"/>
+        </w:rPr>
         <w:t>Chapter 23 — The Faith Goes Global</w:t>
       </w:r>
     </w:p>
@@ -6987,10 +7219,18 @@
     </w:p>
     <w:p>
       <w:pPr>
-        <w:pStyle w:val="ChapHead"/>
-        <w:outlineLvl w:val="1"/>
-      </w:pPr>
-      <w:r>
+        <w:pStyle w:val="Heading2"/>
+        <w:keepNext/>
+        <w:spacing w:before="600" w:after="320"/>
+        <w:jc w:val="center"/>
+      </w:pPr>
+      <w:r>
+        <w:rPr>
+          <w:rFonts w:ascii="Georgia" w:hAnsi="Georgia"/>
+          <w:b/>
+          <w:color w:val="1A1A1A"/>
+          <w:sz w:val="34"/>
+        </w:rPr>
         <w:t>Chapter 24 — The Future of the Latter-day Saints</w:t>
       </w:r>
     </w:p>
@@ -7312,10 +7552,18 @@
     </w:p>
     <w:p>
       <w:pPr>
-        <w:pStyle w:val="PartHead"/>
-        <w:outlineLvl w:val="0"/>
-      </w:pPr>
-      <w:r>
+        <w:pStyle w:val="Heading1"/>
+        <w:keepNext/>
+        <w:spacing w:before="720" w:after="360"/>
+        <w:jc w:val="center"/>
+      </w:pPr>
+      <w:r>
+        <w:rPr>
+          <w:rFonts w:ascii="Georgia" w:hAnsi="Georgia"/>
+          <w:b/>
+          <w:color w:val="1A1A1A"/>
+          <w:sz w:val="48"/>
+        </w:rPr>
         <w:t>BACK MATTER</w:t>
       </w:r>
     </w:p>
@@ -7326,10 +7574,18 @@
     </w:p>
     <w:p>
       <w:pPr>
-        <w:pStyle w:val="ChapHead"/>
-        <w:outlineLvl w:val="1"/>
-      </w:pPr>
-      <w:r>
+        <w:pStyle w:val="Heading2"/>
+        <w:keepNext/>
+        <w:spacing w:before="600" w:after="320"/>
+        <w:jc w:val="center"/>
+      </w:pPr>
+      <w:r>
+        <w:rPr>
+          <w:rFonts w:ascii="Georgia" w:hAnsi="Georgia"/>
+          <w:b/>
+          <w:color w:val="1A1A1A"/>
+          <w:sz w:val="34"/>
+        </w:rPr>
         <w:t>A Timeline of the Latter-day Saints</w:t>
       </w:r>
     </w:p>
@@ -7666,10 +7922,18 @@
     </w:p>
     <w:p>
       <w:pPr>
-        <w:pStyle w:val="ChapHead"/>
-        <w:outlineLvl w:val="1"/>
-      </w:pPr>
-      <w:r>
+        <w:pStyle w:val="Heading2"/>
+        <w:keepNext/>
+        <w:spacing w:before="600" w:after="320"/>
+        <w:jc w:val="center"/>
+      </w:pPr>
+      <w:r>
+        <w:rPr>
+          <w:rFonts w:ascii="Georgia" w:hAnsi="Georgia"/>
+          <w:b/>
+          <w:color w:val="1A1A1A"/>
+          <w:sz w:val="34"/>
+        </w:rPr>
         <w:t>A Glossary of Key Terms</w:t>
       </w:r>
     </w:p>
@@ -8123,10 +8387,18 @@
     </w:p>
     <w:p>
       <w:pPr>
-        <w:pStyle w:val="ChapHead"/>
-        <w:outlineLvl w:val="1"/>
-      </w:pPr>
-      <w:r>
+        <w:pStyle w:val="Heading2"/>
+        <w:keepNext/>
+        <w:spacing w:before="600" w:after="320"/>
+        <w:jc w:val="center"/>
+      </w:pPr>
+      <w:r>
+        <w:rPr>
+          <w:rFonts w:ascii="Georgia" w:hAnsi="Georgia"/>
+          <w:b/>
+          <w:color w:val="1A1A1A"/>
+          <w:sz w:val="34"/>
+        </w:rPr>
         <w:t>A Note on Further Reading</w:t>
       </w:r>
     </w:p>
@@ -8230,10 +8502,18 @@
     </w:p>
     <w:p>
       <w:pPr>
-        <w:pStyle w:val="ChapHead"/>
-        <w:outlineLvl w:val="1"/>
-      </w:pPr>
-      <w:r>
+        <w:pStyle w:val="Heading2"/>
+        <w:keepNext/>
+        <w:spacing w:before="600" w:after="320"/>
+        <w:jc w:val="center"/>
+      </w:pPr>
+      <w:r>
+        <w:rPr>
+          <w:rFonts w:ascii="Georgia" w:hAnsi="Georgia"/>
+          <w:b/>
+          <w:color w:val="1A1A1A"/>
+          <w:sz w:val="34"/>
+        </w:rPr>
         <w:t>A Final Word to the Reader</w:t>
       </w:r>
     </w:p>
@@ -8269,10 +8549,18 @@
     </w:p>
     <w:p>
       <w:pPr>
-        <w:pStyle w:val="ChapHead"/>
-        <w:outlineLvl w:val="1"/>
-      </w:pPr>
-      <w:r>
+        <w:pStyle w:val="Heading2"/>
+        <w:keepNext/>
+        <w:spacing w:before="600" w:after="320"/>
+        <w:jc w:val="center"/>
+      </w:pPr>
+      <w:r>
+        <w:rPr>
+          <w:rFonts w:ascii="Georgia" w:hAnsi="Georgia"/>
+          <w:b/>
+          <w:color w:val="1A1A1A"/>
+          <w:sz w:val="34"/>
+        </w:rPr>
         <w:t>About This Book</w:t>
       </w:r>
     </w:p>
@@ -8305,10 +8593,18 @@
     </w:p>
     <w:p>
       <w:pPr>
-        <w:pStyle w:val="ChapHead"/>
-        <w:outlineLvl w:val="1"/>
-      </w:pPr>
-      <w:r>
+        <w:pStyle w:val="Heading2"/>
+        <w:keepNext/>
+        <w:spacing w:before="600" w:after="320"/>
+        <w:jc w:val="center"/>
+      </w:pPr>
+      <w:r>
+        <w:rPr>
+          <w:rFonts w:ascii="Georgia" w:hAnsi="Georgia"/>
+          <w:b/>
+          <w:color w:val="1A1A1A"/>
+          <w:sz w:val="34"/>
+        </w:rPr>
         <w:t>Also by Sophie E T</w:t>
       </w:r>
     </w:p>

</xml_diff>